<commit_message>
scopus: keep the relay key in the tester's copy
Reverts the key substitution from the previous commit, at Ilan's call: the
repository is private, the relay is a test fixture, and a tester who has to
ask someone for a key before Step C2 is a tester who stops. The generator
still takes it from SCOPUS_RELAY_KEY rather than carrying it in source, so
the key lives in the built document only.

Content is otherwise unchanged from the previous commit - the tracked-changes
copy is rebuilt against the last document that carried the key, so its markup
shows the SIM and transport edits alone rather than a spurious key change.
</commit_message>
<xml_diff>
--- a/scopus/Scopus_Tester_Manual_tracked.docx
+++ b/scopus/Scopus_Tester_Manual_tracked.docx
@@ -19,9 +19,28 @@
       </w:r>
     </w:p>
     <w:p>
-      <w:r>
-        <w:t>Generated 2026-08-10 from scopus/make_tester_manual.py. Every command below was run, in this order, on the bench PC this document is written for, and each “Expected” block is the output that came back. The one exception is Step 9, which needs a person standing in front of the camera; its example is a real live detection recorded on the same bench.</w:t>
-      </w:r>
+      <w:pPr>
+        <w:rPr>
+          <w:del w:id="1" w:author="Scopus test procedure" w:date="2026-08-09T00:00:00Z"/>
+        </w:rPr>
+      </w:pPr>
+      <w:del w:id="2" w:author="Scopus test procedure" w:date="2026-08-09T00:00:00Z">
+        <w:r>
+          <w:delText xml:space="preserve">Generated 2026-08-09 from scopus/make_tester_manual.py. Every command below was run, in this order, on the bench PC this document is written for, and each “Expected” block is the output that came back. The one exception is Step 9, which needs a person standing in front of the camera; its example is a real live detection recorded on the same bench.</w:delText>
+        </w:r>
+      </w:del>
+    </w:p>
+    <w:p>
+      <w:pPr>
+        <w:rPr>
+          <w:ins w:id="3" w:author="Scopus test procedure" w:date="2026-08-09T00:00:00Z"/>
+        </w:rPr>
+      </w:pPr>
+      <w:ins w:id="4" w:author="Scopus test procedure" w:date="2026-08-09T00:00:00Z">
+        <w:r>
+          <w:t>Generated 2026-08-10 from scopus/make_tester_manual.py. Every command below was run, in this order, on the bench PC this document is written for, and each “Expected” block is the output that came back. The one exception is Step 9, which needs a person standing in front of the camera; its example is a real live detection recorded on the same bench.</w:t>
+        </w:r>
+      </w:ins>
     </w:p>
     <w:p>
       <w:pPr>
@@ -4319,10 +4338,10 @@
     <w:p>
       <w:pPr>
         <w:rPr>
-          <w:ins w:id="1" w:author="Scopus test procedure" w:date="2026-08-09T00:00:00Z"/>
+          <w:ins w:id="5" w:author="Scopus test procedure" w:date="2026-08-09T00:00:00Z"/>
         </w:rPr>
       </w:pPr>
-      <w:ins w:id="2" w:author="Scopus test procedure" w:date="2026-08-09T00:00:00Z">
+      <w:ins w:id="6" w:author="Scopus test procedure" w:date="2026-08-09T00:00:00Z">
         <w:r>
           <w:t>First: which SIM is the modem actually using? This board has room for two — the plastic card you can see, and a second one soldered onto it — and the modem uses whichever it was last told to. Ask it:</w:t>
         </w:r>
@@ -4333,10 +4352,10 @@
         <w:spacing w:after="80"/>
         <w:ind w:left="432"/>
         <w:rPr>
-          <w:ins w:id="3" w:author="Scopus test procedure" w:date="2026-08-09T00:00:00Z"/>
+          <w:ins w:id="7" w:author="Scopus test procedure" w:date="2026-08-09T00:00:00Z"/>
         </w:rPr>
       </w:pPr>
-      <w:ins w:id="4" w:author="Scopus test procedure" w:date="2026-08-09T00:00:00Z">
+      <w:ins w:id="8" w:author="Scopus test procedure" w:date="2026-08-09T00:00:00Z">
         <w:r>
           <w:rPr>
             <w:rFonts w:ascii="Consolas" w:hAnsi="Consolas"/>
@@ -4352,10 +4371,10 @@
       <w:pPr>
         <w:spacing w:after="40"/>
         <w:rPr>
-          <w:ins w:id="5" w:author="Scopus test procedure" w:date="2026-08-09T00:00:00Z"/>
+          <w:ins w:id="9" w:author="Scopus test procedure" w:date="2026-08-09T00:00:00Z"/>
         </w:rPr>
       </w:pPr>
-      <w:ins w:id="6" w:author="Scopus test procedure" w:date="2026-08-09T00:00:00Z">
+      <w:ins w:id="10" w:author="Scopus test procedure" w:date="2026-08-09T00:00:00Z">
         <w:r>
           <w:rPr>
             <w:b/>
@@ -4371,10 +4390,10 @@
         <w:spacing w:after="80"/>
         <w:ind w:left="432"/>
         <w:rPr>
-          <w:ins w:id="7" w:author="Scopus test procedure" w:date="2026-08-09T00:00:00Z"/>
+          <w:ins w:id="11" w:author="Scopus test procedure" w:date="2026-08-09T00:00:00Z"/>
         </w:rPr>
       </w:pPr>
-      <w:ins w:id="8" w:author="Scopus test procedure" w:date="2026-08-09T00:00:00Z">
+      <w:ins w:id="12" w:author="Scopus test procedure" w:date="2026-08-09T00:00:00Z">
         <w:r>
           <w:rPr>
             <w:rFonts w:ascii="Consolas" w:hAnsi="Consolas"/>
@@ -4391,10 +4410,10 @@
     <w:p>
       <w:pPr>
         <w:rPr>
-          <w:ins w:id="9" w:author="Scopus test procedure" w:date="2026-08-09T00:00:00Z"/>
+          <w:ins w:id="13" w:author="Scopus test procedure" w:date="2026-08-09T00:00:00Z"/>
         </w:rPr>
       </w:pPr>
-      <w:ins w:id="10" w:author="Scopus test procedure" w:date="2026-08-09T00:00:00Z">
+      <w:ins w:id="14" w:author="Scopus test procedure" w:date="2026-08-09T00:00:00Z">
         <w:r>
           <w:t>The first two numbers must match: the first is the card the product is configured to use, the second is the one it is on. The ICCID is the long number printed on the SIM itself — check it is the card you put in.</w:t>
         </w:r>
@@ -4404,10 +4423,10 @@
       <w:pPr>
         <w:ind w:left="432"/>
         <w:rPr>
-          <w:ins w:id="11" w:author="Scopus test procedure" w:date="2026-08-09T00:00:00Z"/>
+          <w:ins w:id="15" w:author="Scopus test procedure" w:date="2026-08-09T00:00:00Z"/>
         </w:rPr>
       </w:pPr>
-      <w:ins w:id="12" w:author="Scopus test procedure" w:date="2026-08-09T00:00:00Z">
+      <w:ins w:id="16" w:author="Scopus test procedure" w:date="2026-08-09T00:00:00Z">
         <w:r>
           <w:rPr>
             <w:i/>
@@ -4423,10 +4442,10 @@
         <w:spacing w:after="80"/>
         <w:ind w:left="432"/>
         <w:rPr>
-          <w:ins w:id="13" w:author="Scopus test procedure" w:date="2026-08-09T00:00:00Z"/>
+          <w:ins w:id="17" w:author="Scopus test procedure" w:date="2026-08-09T00:00:00Z"/>
         </w:rPr>
       </w:pPr>
-      <w:ins w:id="14" w:author="Scopus test procedure" w:date="2026-08-09T00:00:00Z">
+      <w:ins w:id="18" w:author="Scopus test procedure" w:date="2026-08-09T00:00:00Z">
         <w:r>
           <w:rPr>
             <w:rFonts w:ascii="Consolas" w:hAnsi="Consolas"/>
@@ -4441,10 +4460,10 @@
     <w:p>
       <w:pPr>
         <w:rPr>
-          <w:ins w:id="15" w:author="Scopus test procedure" w:date="2026-08-09T00:00:00Z"/>
+          <w:ins w:id="19" w:author="Scopus test procedure" w:date="2026-08-09T00:00:00Z"/>
         </w:rPr>
       </w:pPr>
-      <w:ins w:id="16" w:author="Scopus test procedure" w:date="2026-08-09T00:00:00Z">
+      <w:ins w:id="20" w:author="Scopus test procedure" w:date="2026-08-09T00:00:00Z">
         <w:r>
           <w:t>1 is the plastic holder, 2 the second holder, 0 the soldered one.</w:t>
         </w:r>
@@ -4453,7 +4472,7 @@
     <w:p>
       <w:pPr>
         <w:rPr>
-          <w:ins w:id="17" w:author="Scopus test procedure" w:date="2026-08-09T00:00:00Z"/>
+          <w:ins w:id="21" w:author="Scopus test procedure" w:date="2026-08-09T00:00:00Z"/>
         </w:rPr>
       </w:pPr>
     </w:p>
@@ -4647,52 +4666,67 @@
       <w:pPr>
         <w:spacing w:after="80"/>
         <w:ind w:left="432"/>
-      </w:pPr>
-      <w:r>
         <w:rPr>
-          <w:rFonts w:ascii="Consolas" w:hAnsi="Consolas"/>
-          <w:b/>
-          <w:color w:val="1F3D7A"/>
-          <w:sz w:val="18"/>
+          <w:del w:id="22" w:author="Scopus test procedure" w:date="2026-08-09T00:00:00Z"/>
         </w:rPr>
-        <w:t>cd ~/work/itpnovex/edgeai &amp;&amp; python3 scopus/at.py --point-cloud 165.22.181.245 --http-port 80 --udp-port 39999 --path /scopus/upload --apn internet</w:t>
-      </w:r>
+      </w:pPr>
+      <w:del w:id="23" w:author="Scopus test procedure" w:date="2026-08-09T00:00:00Z">
+        <w:r>
+          <w:rPr>
+            <w:rFonts w:ascii="Consolas" w:hAnsi="Consolas"/>
+            <w:b/>
+            <w:color w:val="1F3D7A"/>
+            <w:sz w:val="18"/>
+          </w:rPr>
+          <w:delText xml:space="preserve">cd ~/work/itpnovex/edgeai &amp;&amp; python3 scopus/at.py --point-cloud 165.22.181.245 --http-port 80 --udp-port 39999 --path /scopus/upload --apn m2m.jtglobal.com</w:delText>
+        </w:r>
+      </w:del>
     </w:p>
     <w:p>
       <w:pPr>
         <w:ind w:left="432"/>
-      </w:pPr>
-      <w:r>
         <w:rPr>
-          <w:i/>
-          <w:color w:val="444444"/>
-          <w:sz w:val="18"/>
+          <w:del w:id="24" w:author="Scopus test procedure" w:date="2026-08-09T00:00:00Z"/>
         </w:rPr>
-        <w:t>internet is the APN for the SIM in this bench. A different SIM needs a different one, and the wrong APN looks exactly like a dead SIM — so if you were given one, use it here rather than assuming this line still applies.</w:t>
-      </w:r>
+      </w:pPr>
+      <w:del w:id="25" w:author="Scopus test procedure" w:date="2026-08-09T00:00:00Z">
+        <w:r>
+          <w:rPr>
+            <w:i/>
+            <w:color w:val="444444"/>
+            <w:sz w:val="18"/>
+          </w:rPr>
+          <w:delText xml:space="preserve">m2m.jtglobal.com is the APN for the SIM in this bench. A different SIM needs a different one, and the wrong APN looks exactly like a dead SIM — so if you were given one, use it here rather than assuming this line still applies.</w:delText>
+        </w:r>
+      </w:del>
     </w:p>
     <w:p>
       <w:pPr>
         <w:spacing w:after="40"/>
-      </w:pPr>
-      <w:r>
         <w:rPr>
-          <w:b/>
-          <w:color w:val="1E6B2E"/>
-          <w:sz w:val="20"/>
+          <w:del w:id="26" w:author="Scopus test procedure" w:date="2026-08-09T00:00:00Z"/>
         </w:rPr>
-        <w:t>Expected:</w:t>
-      </w:r>
+      </w:pPr>
+      <w:del w:id="27" w:author="Scopus test procedure" w:date="2026-08-09T00:00:00Z">
+        <w:r>
+          <w:rPr>
+            <w:b/>
+            <w:color w:val="1E6B2E"/>
+            <w:sz w:val="20"/>
+          </w:rPr>
+          <w:delText xml:space="preserve">Expected:</w:delText>
+        </w:r>
+      </w:del>
     </w:p>
     <w:p>
       <w:pPr>
         <w:spacing w:after="80"/>
         <w:ind w:left="432"/>
         <w:rPr>
-          <w:del w:id="18" w:author="Scopus test procedure" w:date="2026-08-09T00:00:00Z"/>
+          <w:del w:id="28" w:author="Scopus test procedure" w:date="2026-08-09T00:00:00Z"/>
         </w:rPr>
       </w:pPr>
-      <w:del w:id="19" w:author="Scopus test procedure" w:date="2026-08-09T00:00:00Z">
+      <w:del w:id="29" w:author="Scopus test procedure" w:date="2026-08-09T00:00:00Z">
         <w:r>
           <w:rPr>
             <w:rFonts w:ascii="Consolas" w:hAnsi="Consolas"/>
@@ -4720,10 +4754,66 @@
         <w:spacing w:after="80"/>
         <w:ind w:left="432"/>
         <w:rPr>
-          <w:ins w:id="20" w:author="Scopus test procedure" w:date="2026-08-09T00:00:00Z"/>
+          <w:ins w:id="30" w:author="Scopus test procedure" w:date="2026-08-09T00:00:00Z"/>
         </w:rPr>
       </w:pPr>
-      <w:ins w:id="21" w:author="Scopus test procedure" w:date="2026-08-09T00:00:00Z">
+      <w:ins w:id="31" w:author="Scopus test procedure" w:date="2026-08-09T00:00:00Z">
+        <w:r>
+          <w:rPr>
+            <w:rFonts w:ascii="Consolas" w:hAnsi="Consolas"/>
+            <w:b/>
+            <w:color w:val="1F3D7A"/>
+            <w:sz w:val="18"/>
+          </w:rPr>
+          <w:t>cd ~/work/itpnovex/edgeai &amp;&amp; python3 scopus/at.py --point-cloud 165.22.181.245 --http-port 80 --udp-port 39999 --path /scopus/upload --apn internet</w:t>
+        </w:r>
+      </w:ins>
+    </w:p>
+    <w:p>
+      <w:pPr>
+        <w:ind w:left="432"/>
+        <w:rPr>
+          <w:ins w:id="32" w:author="Scopus test procedure" w:date="2026-08-09T00:00:00Z"/>
+        </w:rPr>
+      </w:pPr>
+      <w:ins w:id="33" w:author="Scopus test procedure" w:date="2026-08-09T00:00:00Z">
+        <w:r>
+          <w:rPr>
+            <w:i/>
+            <w:color w:val="444444"/>
+            <w:sz w:val="18"/>
+          </w:rPr>
+          <w:t>internet is the APN for the SIM in this bench. A different SIM needs a different one, and the wrong APN looks exactly like a dead SIM — so if you were given one, use it here rather than assuming this line still applies.</w:t>
+        </w:r>
+      </w:ins>
+    </w:p>
+    <w:p>
+      <w:pPr>
+        <w:spacing w:after="40"/>
+        <w:rPr>
+          <w:ins w:id="34" w:author="Scopus test procedure" w:date="2026-08-09T00:00:00Z"/>
+        </w:rPr>
+      </w:pPr>
+      <w:ins w:id="35" w:author="Scopus test procedure" w:date="2026-08-09T00:00:00Z">
+        <w:r>
+          <w:rPr>
+            <w:b/>
+            <w:color w:val="1E6B2E"/>
+            <w:sz w:val="20"/>
+          </w:rPr>
+          <w:t>Expected:</w:t>
+        </w:r>
+      </w:ins>
+    </w:p>
+    <w:p>
+      <w:pPr>
+        <w:spacing w:after="80"/>
+        <w:ind w:left="432"/>
+        <w:rPr>
+          <w:ins w:id="36" w:author="Scopus test procedure" w:date="2026-08-09T00:00:00Z"/>
+        </w:rPr>
+      </w:pPr>
+      <w:ins w:id="37" w:author="Scopus test procedure" w:date="2026-08-09T00:00:00Z">
         <w:r>
           <w:rPr>
             <w:rFonts w:ascii="Consolas" w:hAnsi="Consolas"/>
@@ -4750,10 +4840,10 @@
       <w:pPr>
         <w:ind w:left="432"/>
         <w:rPr>
-          <w:ins w:id="22" w:author="Scopus test procedure" w:date="2026-08-09T00:00:00Z"/>
+          <w:ins w:id="38" w:author="Scopus test procedure" w:date="2026-08-09T00:00:00Z"/>
         </w:rPr>
       </w:pPr>
-      <w:ins w:id="23" w:author="Scopus test procedure" w:date="2026-08-09T00:00:00Z">
+      <w:ins w:id="39" w:author="Scopus test procedure" w:date="2026-08-09T00:00:00Z">
         <w:r>
           <w:rPr>
             <w:i/>
@@ -4979,7 +5069,7 @@
           <w:color w:val="1F3D7A"/>
           <w:sz w:val="18"/>
         </w:rPr>
-        <w:t>cd ~/work/itpnovex/edgeai &amp;&amp; python3 scopus/relay_pull.py --relay http://165.22.181.245/scopus --key &lt;ask-for-the-relay-key&gt; --fresh</w:t>
+        <w:t>cd ~/work/itpnovex/edgeai &amp;&amp; python3 scopus/relay_pull.py --relay http://165.22.181.245/scopus --key EQgIvDN1ZWx-432E7MpxUDoR --fresh</w:t>
       </w:r>
     </w:p>
     <w:p>
@@ -5094,10 +5184,10 @@
       <w:pPr>
         <w:ind w:left="432"/>
         <w:rPr>
-          <w:ins w:id="24" w:author="Scopus test procedure" w:date="2026-08-09T00:00:00Z"/>
+          <w:ins w:id="40" w:author="Scopus test procedure" w:date="2026-08-09T00:00:00Z"/>
         </w:rPr>
       </w:pPr>
-      <w:ins w:id="25" w:author="Scopus test procedure" w:date="2026-08-09T00:00:00Z">
+      <w:ins w:id="41" w:author="Scopus test procedure" w:date="2026-08-09T00:00:00Z">
         <w:r>
           <w:rPr>
             <w:i/>
@@ -5251,7 +5341,7 @@
       </w:tr>
       <w:tr>
         <w:trPr>
-          <w:del w:id="26" w:author="Scopus test procedure" w:date="2026-08-09T00:00:00Z"/>
+          <w:del w:id="42" w:author="Scopus test procedure" w:date="2026-08-09T00:00:00Z"/>
         </w:trPr>
         <w:tc>
           <w:tcPr>
@@ -5260,10 +5350,10 @@
           <w:p>
             <w:pPr>
               <w:rPr>
-                <w:del w:id="27" w:author="Scopus test procedure" w:date="2026-08-09T00:00:00Z"/>
+                <w:del w:id="43" w:author="Scopus test procedure" w:date="2026-08-09T00:00:00Z"/>
               </w:rPr>
             </w:pPr>
-            <w:del w:id="28" w:author="Scopus test procedure" w:date="2026-08-09T00:00:00Z">
+            <w:del w:id="44" w:author="Scopus test procedure" w:date="2026-08-09T00:00:00Z">
               <w:r>
                 <w:delText xml:space="preserve">Photos arrive but events do not</w:delText>
               </w:r>
@@ -5277,10 +5367,10 @@
           <w:p>
             <w:pPr>
               <w:rPr>
-                <w:del w:id="29" w:author="Scopus test procedure" w:date="2026-08-09T00:00:00Z"/>
+                <w:del w:id="45" w:author="Scopus test procedure" w:date="2026-08-09T00:00:00Z"/>
               </w:rPr>
             </w:pPr>
-            <w:del w:id="30" w:author="Scopus test procedure" w:date="2026-08-09T00:00:00Z">
+            <w:del w:id="46" w:author="Scopus test procedure" w:date="2026-08-09T00:00:00Z">
               <w:r>
                 <w:delText xml:space="preserve">These use different ports and different protocols — photos go over TCP 80, events over UDP 39999. Photos arriving proves the mobile connection works, so the difference is the UDP port. Report it; it is a firewall rule on the server, not anything on the bench.</w:delText>
               </w:r>
@@ -5290,7 +5380,7 @@
       </w:tr>
       <w:tr>
         <w:trPr>
-          <w:ins w:id="31" w:author="Scopus test procedure" w:date="2026-08-09T00:00:00Z"/>
+          <w:ins w:id="47" w:author="Scopus test procedure" w:date="2026-08-09T00:00:00Z"/>
         </w:trPr>
         <w:tc>
           <w:tcPr>
@@ -5299,10 +5389,10 @@
           <w:p>
             <w:pPr>
               <w:rPr>
-                <w:ins w:id="32" w:author="Scopus test procedure" w:date="2026-08-09T00:00:00Z"/>
+                <w:ins w:id="48" w:author="Scopus test procedure" w:date="2026-08-09T00:00:00Z"/>
               </w:rPr>
             </w:pPr>
-            <w:ins w:id="33" w:author="Scopus test procedure" w:date="2026-08-09T00:00:00Z">
+            <w:ins w:id="49" w:author="Scopus test procedure" w:date="2026-08-09T00:00:00Z">
               <w:r>
                 <w:t>Photos arrive but events do not</w:t>
               </w:r>
@@ -5316,10 +5406,10 @@
           <w:p>
             <w:pPr>
               <w:rPr>
-                <w:ins w:id="34" w:author="Scopus test procedure" w:date="2026-08-09T00:00:00Z"/>
+                <w:ins w:id="50" w:author="Scopus test procedure" w:date="2026-08-09T00:00:00Z"/>
               </w:rPr>
             </w:pPr>
-            <w:ins w:id="35" w:author="Scopus test procedure" w:date="2026-08-09T00:00:00Z">
+            <w:ins w:id="51" w:author="Scopus test procedure" w:date="2026-08-09T00:00:00Z">
               <w:r>
                 <w:t>On this procedure both travel the same way, over port 80, so one arriving and not the other is not a network problem. Check the modem is set to send events as web requests:  cd ~/work/itpnovex/edgeai &amp;&amp; python3 scopus/at.py "AT+SDVRNTFPROTO?"  — it should answer 1 and "/scopus/notify". If it answers 0 the modem is still sending datagrams, which the relay's host does not accept; re-run Step C1.</w:t>
               </w:r>
@@ -5329,7 +5419,7 @@
       </w:tr>
       <w:tr>
         <w:trPr>
-          <w:ins w:id="36" w:author="Scopus test procedure" w:date="2026-08-09T00:00:00Z"/>
+          <w:ins w:id="52" w:author="Scopus test procedure" w:date="2026-08-09T00:00:00Z"/>
         </w:trPr>
         <w:tc>
           <w:tcPr>
@@ -5338,10 +5428,10 @@
           <w:p>
             <w:pPr>
               <w:rPr>
-                <w:ins w:id="37" w:author="Scopus test procedure" w:date="2026-08-09T00:00:00Z"/>
+                <w:ins w:id="53" w:author="Scopus test procedure" w:date="2026-08-09T00:00:00Z"/>
               </w:rPr>
             </w:pPr>
-            <w:ins w:id="38" w:author="Scopus test procedure" w:date="2026-08-09T00:00:00Z">
+            <w:ins w:id="54" w:author="Scopus test procedure" w:date="2026-08-09T00:00:00Z">
               <w:r>
                 <w:t>Everything passes but nothing is ever delivered</w:t>
               </w:r>
@@ -5355,10 +5445,10 @@
           <w:p>
             <w:pPr>
               <w:rPr>
-                <w:ins w:id="39" w:author="Scopus test procedure" w:date="2026-08-09T00:00:00Z"/>
+                <w:ins w:id="55" w:author="Scopus test procedure" w:date="2026-08-09T00:00:00Z"/>
               </w:rPr>
             </w:pPr>
-            <w:ins w:id="40" w:author="Scopus test procedure" w:date="2026-08-09T00:00:00Z">
+            <w:ins w:id="56" w:author="Scopus test procedure" w:date="2026-08-09T00:00:00Z">
               <w:r>
                 <w:t>Check which SIM the modem is on — Step C0. On the wrong card every check in this section passes and no data crosses. That is the single most likely cause of this exact symptom.</w:t>
               </w:r>

</xml_diff>